<commit_message>
Update final project documents and diagrams for Activity 4
</commit_message>
<xml_diff>
--- a/Project_Initialization/Documents/Business Case/Business_Case_GroupG_EcosystemApp.docx
+++ b/Project_Initialization/Documents/Business Case/Business_Case_GroupG_EcosystemApp.docx
@@ -229,28 +229,58 @@
                 <w:szCs w:val="24"/>
                 <w:lang w:eastAsia="en-CA"/>
               </w:rPr>
-              <w:t>A web-based educational application designed for children in Grades 2–3 (approximately ages 7–8) that introduces freshwater animals through simple, interactive discovery, with an emphasis on basic ecosystem understanding and conservation awareness. All educational content will be written at an approximate Grade 2–3 reading level to ensure clarity and accessibility for the intended audience.</w:t>
-            </w:r>
-          </w:p>
-          <w:p>
-            <w:pPr>
-              <w:widowControl w:val="0"/>
-              <w:pBdr>
-                <w:top w:val="nil"/>
-                <w:left w:val="nil"/>
-                <w:bottom w:val="nil"/>
-                <w:right w:val="nil"/>
-                <w:between w:val="nil"/>
-              </w:pBdr>
-              <w:spacing w:after="0" w:line="240" w:lineRule="auto"/>
-              <w:rPr>
-                <w:rFonts w:ascii="Times New Roman" w:eastAsia="Arial" w:hAnsi="Times New Roman" w:cs="Times New Roman"/>
-                <w:color w:val="000000"/>
-                <w:sz w:val="24"/>
-                <w:szCs w:val="24"/>
-                <w:lang w:eastAsia="en-CA"/>
-              </w:rPr>
-            </w:pPr>
+              <w:t xml:space="preserve">A browser-based educational web application designed for children in Grades 2–3 (approximately ages 7–8) that introduces Saskatchewan freshwater animals through interactive gameplay, including a timed hint-based discovery game, a sticker-book collection system, and supporting educational videos. </w:t>
+            </w:r>
+          </w:p>
+          <w:p>
+            <w:pPr>
+              <w:widowControl w:val="0"/>
+              <w:pBdr>
+                <w:top w:val="nil"/>
+                <w:left w:val="nil"/>
+                <w:bottom w:val="nil"/>
+                <w:right w:val="nil"/>
+                <w:between w:val="nil"/>
+              </w:pBdr>
+              <w:spacing w:after="0" w:line="240" w:lineRule="auto"/>
+              <w:rPr>
+                <w:rFonts w:ascii="Times New Roman" w:eastAsia="Arial" w:hAnsi="Times New Roman" w:cs="Times New Roman"/>
+                <w:color w:val="000000"/>
+                <w:sz w:val="24"/>
+                <w:szCs w:val="24"/>
+                <w:lang w:eastAsia="en-CA"/>
+              </w:rPr>
+            </w:pPr>
+          </w:p>
+          <w:p>
+            <w:pPr>
+              <w:widowControl w:val="0"/>
+              <w:pBdr>
+                <w:top w:val="nil"/>
+                <w:left w:val="nil"/>
+                <w:bottom w:val="nil"/>
+                <w:right w:val="nil"/>
+                <w:between w:val="nil"/>
+              </w:pBdr>
+              <w:spacing w:after="0" w:line="240" w:lineRule="auto"/>
+              <w:rPr>
+                <w:rFonts w:ascii="Times New Roman" w:eastAsia="Arial" w:hAnsi="Times New Roman" w:cs="Times New Roman"/>
+                <w:color w:val="000000"/>
+                <w:sz w:val="24"/>
+                <w:szCs w:val="24"/>
+                <w:lang w:eastAsia="en-CA"/>
+              </w:rPr>
+            </w:pPr>
+            <w:r>
+              <w:rPr>
+                <w:rFonts w:ascii="Times New Roman" w:eastAsia="Arial" w:hAnsi="Times New Roman" w:cs="Times New Roman"/>
+                <w:color w:val="000000"/>
+                <w:sz w:val="24"/>
+                <w:szCs w:val="24"/>
+                <w:lang w:eastAsia="en-CA"/>
+              </w:rPr>
+              <w:t>The application emphasizes basic ecosystem understanding and conservation awareness using a 2D cartoon-style interface. All educational content is written at an approximate Grade 2–3 reading level to ensure clarity and accessibility for the intended audience.</w:t>
+            </w:r>
           </w:p>
         </w:tc>
       </w:tr>
@@ -439,68 +469,78 @@
                 <w:szCs w:val="24"/>
                 <w:lang w:eastAsia="en-CA"/>
               </w:rPr>
-              <w:t>Environmental education for children in Grades 2–3 is often delivered through textbooks or static digital content, which can limit engagement and make ecosystem concepts difficult to understand. Freshwater ecosystems are among the most familiar and locally relevant environments for young learners, yet there are few age-appropriate, interactive tools that allow children to explore freshwater animals in a simple and meaningful way.</w:t>
-            </w:r>
-          </w:p>
-          <w:p>
-            <w:pPr>
-              <w:widowControl w:val="0"/>
-              <w:pBdr>
-                <w:top w:val="nil"/>
-                <w:left w:val="nil"/>
-                <w:bottom w:val="nil"/>
-                <w:right w:val="nil"/>
-                <w:between w:val="nil"/>
-              </w:pBdr>
-              <w:spacing w:after="0" w:line="240" w:lineRule="auto"/>
-              <w:rPr>
-                <w:rFonts w:ascii="Times New Roman" w:eastAsia="Arial" w:hAnsi="Times New Roman" w:cs="Times New Roman"/>
-                <w:color w:val="000000"/>
-                <w:sz w:val="24"/>
-                <w:szCs w:val="24"/>
-                <w:lang w:eastAsia="en-CA"/>
-              </w:rPr>
-            </w:pPr>
-            <w:r>
-              <w:rPr>
-                <w:rFonts w:ascii="Times New Roman" w:eastAsia="Arial" w:hAnsi="Times New Roman" w:cs="Times New Roman"/>
-                <w:color w:val="000000"/>
-                <w:sz w:val="24"/>
-                <w:szCs w:val="24"/>
-                <w:lang w:eastAsia="en-CA"/>
-              </w:rPr>
-              <w:t>This project proposes a web-based educational application focused on freshwater animals commonly found in Saskatchewan or similar North American freshwater ecosystems. Through interactive discovery and visual learning, the application supports early environmental awareness and curiosity-driven learning while remaining aligned with the cognitive level of children aged 7–8.</w:t>
-            </w:r>
-          </w:p>
-          <w:p>
-            <w:pPr>
-              <w:widowControl w:val="0"/>
-              <w:pBdr>
-                <w:top w:val="nil"/>
-                <w:left w:val="nil"/>
-                <w:bottom w:val="nil"/>
-                <w:right w:val="nil"/>
-                <w:between w:val="nil"/>
-              </w:pBdr>
-              <w:spacing w:after="0" w:line="240" w:lineRule="auto"/>
-              <w:rPr>
-                <w:rFonts w:ascii="Times New Roman" w:eastAsia="Arial" w:hAnsi="Times New Roman" w:cs="Times New Roman"/>
-                <w:color w:val="000000"/>
-                <w:sz w:val="24"/>
-                <w:szCs w:val="24"/>
-                <w:lang w:eastAsia="en-CA"/>
-              </w:rPr>
-            </w:pPr>
-            <w:r>
-              <w:rPr>
-                <w:rFonts w:ascii="Times New Roman" w:eastAsia="Arial" w:hAnsi="Times New Roman" w:cs="Times New Roman"/>
-                <w:color w:val="000000"/>
-                <w:sz w:val="24"/>
-                <w:szCs w:val="24"/>
-                <w:lang w:eastAsia="en-CA"/>
-              </w:rPr>
-              <w:t>.</w:t>
-            </w:r>
+              <w:t>Environmental education for children in Grades 2–3 is often delivered through textbooks or static digital content, which can limit engagement and make ecosystem concepts difficult to understand. Freshwater ecosystems are among the most familiar and locally relevant environments for young learners, yet there are few age-appropriate, interactive tools that allow children to actively explore and engage with this content.</w:t>
+            </w:r>
+          </w:p>
+          <w:p>
+            <w:pPr>
+              <w:widowControl w:val="0"/>
+              <w:pBdr>
+                <w:top w:val="nil"/>
+                <w:left w:val="nil"/>
+                <w:bottom w:val="nil"/>
+                <w:right w:val="nil"/>
+                <w:between w:val="nil"/>
+              </w:pBdr>
+              <w:spacing w:after="0" w:line="240" w:lineRule="auto"/>
+              <w:rPr>
+                <w:rFonts w:ascii="Times New Roman" w:eastAsia="Arial" w:hAnsi="Times New Roman" w:cs="Times New Roman"/>
+                <w:color w:val="000000"/>
+                <w:sz w:val="24"/>
+                <w:szCs w:val="24"/>
+                <w:lang w:eastAsia="en-CA"/>
+              </w:rPr>
+            </w:pPr>
+          </w:p>
+          <w:p>
+            <w:pPr>
+              <w:widowControl w:val="0"/>
+              <w:pBdr>
+                <w:top w:val="nil"/>
+                <w:left w:val="nil"/>
+                <w:bottom w:val="nil"/>
+                <w:right w:val="nil"/>
+                <w:between w:val="nil"/>
+              </w:pBdr>
+              <w:spacing w:after="0" w:line="240" w:lineRule="auto"/>
+              <w:rPr>
+                <w:rFonts w:ascii="Times New Roman" w:eastAsia="Arial" w:hAnsi="Times New Roman" w:cs="Times New Roman"/>
+                <w:color w:val="000000"/>
+                <w:sz w:val="24"/>
+                <w:szCs w:val="24"/>
+                <w:lang w:eastAsia="en-CA"/>
+              </w:rPr>
+            </w:pPr>
+            <w:r>
+              <w:rPr>
+                <w:rFonts w:ascii="Times New Roman" w:eastAsia="Arial" w:hAnsi="Times New Roman" w:cs="Times New Roman"/>
+                <w:color w:val="000000"/>
+                <w:sz w:val="24"/>
+                <w:szCs w:val="24"/>
+                <w:lang w:eastAsia="en-CA"/>
+              </w:rPr>
+              <w:t>This project implements a browser-based educational application focused on Saskatchewan freshwater ecosystems. The system provides an interactive discovery experience where children learn by selecting hints, identifying animals in a visual environment, and collecting them in a sticker book. Additional reinforcement is provided through short educational videos.</w:t>
+            </w:r>
+          </w:p>
+          <w:p>
+            <w:pPr>
+              <w:widowControl w:val="0"/>
+              <w:pBdr>
+                <w:top w:val="nil"/>
+                <w:left w:val="nil"/>
+                <w:bottom w:val="nil"/>
+                <w:right w:val="nil"/>
+                <w:between w:val="nil"/>
+              </w:pBdr>
+              <w:spacing w:after="0" w:line="240" w:lineRule="auto"/>
+              <w:rPr>
+                <w:rFonts w:ascii="Times New Roman" w:eastAsia="Arial" w:hAnsi="Times New Roman" w:cs="Times New Roman"/>
+                <w:color w:val="000000"/>
+                <w:sz w:val="24"/>
+                <w:szCs w:val="24"/>
+                <w:lang w:eastAsia="en-CA"/>
+              </w:rPr>
+            </w:pPr>
           </w:p>
           <w:p>
             <w:pPr>
@@ -519,6 +559,16 @@
                 <w:lang w:eastAsia="en-CA"/>
               </w:rPr>
             </w:pPr>
+            <w:r>
+              <w:rPr>
+                <w:rFonts w:ascii="Times New Roman" w:eastAsia="Arial" w:hAnsi="Times New Roman" w:cs="Times New Roman"/>
+                <w:color w:val="000000"/>
+                <w:sz w:val="24"/>
+                <w:szCs w:val="24"/>
+                <w:lang w:eastAsia="en-CA"/>
+              </w:rPr>
+              <w:t>The application combines visual interaction, simple game mechanics, and structured hints to support curiosity-driven learning while remaining aligned with the cognitive level of children aged 7–8.</w:t>
+            </w:r>
           </w:p>
         </w:tc>
       </w:tr>
@@ -613,77 +663,68 @@
                 <w:szCs w:val="24"/>
                 <w:lang w:eastAsia="en-CA"/>
               </w:rPr>
-              <w:t xml:space="preserve">There is a need for </w:t>
-            </w:r>
-            <w:r>
-              <w:rPr>
-                <w:rFonts w:ascii="Times New Roman" w:eastAsia="Arial" w:hAnsi="Times New Roman" w:cs="Times New Roman"/>
-                <w:color w:val="000000"/>
-                <w:sz w:val="24"/>
-                <w:szCs w:val="24"/>
-                <w:lang w:eastAsia="en-CA"/>
-              </w:rPr>
-              <w:t>engaging</w:t>
-            </w:r>
-            <w:r>
-              <w:rPr>
-                <w:rFonts w:ascii="Times New Roman" w:eastAsia="Arial" w:hAnsi="Times New Roman" w:cs="Times New Roman"/>
-                <w:color w:val="000000"/>
-                <w:sz w:val="24"/>
-                <w:szCs w:val="24"/>
-                <w:lang w:eastAsia="en-CA"/>
-              </w:rPr>
-              <w:t xml:space="preserve"> age-appropriate educational tools that help children in Grades 2–3 actively learn about freshwater ecosystems and conservation. Traditional approaches rely heavily on passive learning, which can reduce understanding and retention at this developmental stage.</w:t>
-            </w:r>
-          </w:p>
-          <w:p>
-            <w:pPr>
-              <w:widowControl w:val="0"/>
-              <w:pBdr>
-                <w:top w:val="nil"/>
-                <w:left w:val="nil"/>
-                <w:bottom w:val="nil"/>
-                <w:right w:val="nil"/>
-                <w:between w:val="nil"/>
-              </w:pBdr>
-              <w:spacing w:after="0" w:line="240" w:lineRule="auto"/>
-              <w:rPr>
-                <w:rFonts w:ascii="Times New Roman" w:eastAsia="Arial" w:hAnsi="Times New Roman" w:cs="Times New Roman"/>
-                <w:color w:val="000000"/>
-                <w:sz w:val="24"/>
-                <w:szCs w:val="24"/>
-                <w:lang w:eastAsia="en-CA"/>
-              </w:rPr>
-            </w:pPr>
-          </w:p>
-          <w:p>
-            <w:pPr>
-              <w:widowControl w:val="0"/>
-              <w:pBdr>
-                <w:top w:val="nil"/>
-                <w:left w:val="nil"/>
-                <w:bottom w:val="nil"/>
-                <w:right w:val="nil"/>
-                <w:between w:val="nil"/>
-              </w:pBdr>
-              <w:spacing w:after="0" w:line="240" w:lineRule="auto"/>
-              <w:rPr>
-                <w:rFonts w:ascii="Times New Roman" w:eastAsia="Arial" w:hAnsi="Times New Roman" w:cs="Times New Roman"/>
-                <w:color w:val="000000"/>
-                <w:sz w:val="24"/>
-                <w:szCs w:val="24"/>
-                <w:lang w:eastAsia="en-CA"/>
-              </w:rPr>
-            </w:pPr>
-            <w:r>
-              <w:rPr>
-                <w:rFonts w:ascii="Times New Roman" w:eastAsia="Arial" w:hAnsi="Times New Roman" w:cs="Times New Roman"/>
-                <w:color w:val="000000"/>
-                <w:sz w:val="24"/>
-                <w:szCs w:val="24"/>
-                <w:lang w:eastAsia="en-CA"/>
-              </w:rPr>
-              <w:t>This project presents an opportunity to enhance early environmental education by providing an interactive, web-based application tailored to the reading and comprehension level of young learners. By focusing on a clearly defined freshwater ecosystem and a limited set of regional animals, the project maintains scope control while delivering meaningful educational value.</w:t>
+              <w:t>There is a need for engaging age-appropriate educational tools that help children in Grades 2–3 actively learn about freshwater ecosystems and conservation. Traditional approaches rely heavily on passive learning, which can reduce understanding and retention at this developmental stage.</w:t>
+            </w:r>
+          </w:p>
+          <w:p>
+            <w:pPr>
+              <w:widowControl w:val="0"/>
+              <w:pBdr>
+                <w:top w:val="nil"/>
+                <w:left w:val="nil"/>
+                <w:bottom w:val="nil"/>
+                <w:right w:val="nil"/>
+                <w:between w:val="nil"/>
+              </w:pBdr>
+              <w:spacing w:after="0" w:line="240" w:lineRule="auto"/>
+              <w:rPr>
+                <w:rFonts w:ascii="Times New Roman" w:eastAsia="Arial" w:hAnsi="Times New Roman" w:cs="Times New Roman"/>
+                <w:color w:val="000000"/>
+                <w:sz w:val="24"/>
+                <w:szCs w:val="24"/>
+                <w:lang w:eastAsia="en-CA"/>
+              </w:rPr>
+            </w:pPr>
+          </w:p>
+          <w:p>
+            <w:pPr>
+              <w:widowControl w:val="0"/>
+              <w:pBdr>
+                <w:top w:val="nil"/>
+                <w:left w:val="nil"/>
+                <w:bottom w:val="nil"/>
+                <w:right w:val="nil"/>
+                <w:between w:val="nil"/>
+              </w:pBdr>
+              <w:spacing w:after="0" w:line="240" w:lineRule="auto"/>
+              <w:rPr>
+                <w:rFonts w:ascii="Times New Roman" w:eastAsia="Arial" w:hAnsi="Times New Roman" w:cs="Times New Roman"/>
+                <w:color w:val="000000"/>
+                <w:sz w:val="24"/>
+                <w:szCs w:val="24"/>
+                <w:lang w:eastAsia="en-CA"/>
+              </w:rPr>
+            </w:pPr>
+            <w:r>
+              <w:rPr>
+                <w:rFonts w:ascii="Times New Roman" w:eastAsia="Arial" w:hAnsi="Times New Roman" w:cs="Times New Roman"/>
+                <w:color w:val="000000"/>
+                <w:sz w:val="24"/>
+                <w:szCs w:val="24"/>
+                <w:lang w:eastAsia="en-CA"/>
+              </w:rPr>
+              <w:t xml:space="preserve">This project presents an opportunity to enhance early environmental education by providing an interactive, web-based application tailored to the reading and comprehension level of young learners. By focusing on a clearly defined freshwater ecosystem and a limited set of regional animals, the project maintains scope control while delivering meaningful </w:t>
+            </w:r>
+            <w:r>
+              <w:rPr>
+                <w:rFonts w:ascii="Times New Roman" w:eastAsia="Arial" w:hAnsi="Times New Roman" w:cs="Times New Roman"/>
+                <w:color w:val="000000"/>
+                <w:sz w:val="24"/>
+                <w:szCs w:val="24"/>
+                <w:lang w:eastAsia="en-CA"/>
+              </w:rPr>
+              <w:lastRenderedPageBreak/>
+              <w:t>educational value.</w:t>
             </w:r>
           </w:p>
           <w:p>
@@ -783,6 +824,7 @@
                 <w:szCs w:val="24"/>
                 <w:lang w:eastAsia="en-CA"/>
               </w:rPr>
+              <w:lastRenderedPageBreak/>
               <w:t>Options</w:t>
             </w:r>
           </w:p>
@@ -865,8 +907,7 @@
                 <w:szCs w:val="24"/>
                 <w:lang w:eastAsia="en-CA"/>
               </w:rPr>
-              <w:lastRenderedPageBreak/>
-              <w:t>Design and implement a web-based educational application</w:t>
+              <w:t>Design and implement a browser-based educational application</w:t>
             </w:r>
           </w:p>
           <w:p>
@@ -900,7 +941,7 @@
                 <w:szCs w:val="24"/>
                 <w:lang w:eastAsia="en-CA"/>
               </w:rPr>
-              <w:t>Focus exclusively on freshwater animals</w:t>
+              <w:t>Focus exclusively on a Saskatchewan freshwater ecosystem</w:t>
             </w:r>
           </w:p>
           <w:p>
@@ -934,7 +975,7 @@
                 <w:szCs w:val="24"/>
                 <w:lang w:eastAsia="en-CA"/>
               </w:rPr>
-              <w:t>Tailor content and interactions for elementary school children</w:t>
+              <w:t>Provide an interactive game experience (hint-based matching with timer and rewards)</w:t>
             </w:r>
           </w:p>
           <w:p>
@@ -968,7 +1009,7 @@
                 <w:szCs w:val="24"/>
                 <w:lang w:eastAsia="en-CA"/>
               </w:rPr>
-              <w:t>Follow an MVC architecture with a database-backed model</w:t>
+              <w:t xml:space="preserve"> Include a sticker-book collection system and educational video content</w:t>
             </w:r>
           </w:p>
           <w:p>
@@ -1002,8 +1043,120 @@
                 <w:szCs w:val="24"/>
                 <w:lang w:eastAsia="en-CA"/>
               </w:rPr>
-              <w:t>Deliver a clearly defined Minimum Viable Product (MVP)</w:t>
-            </w:r>
+              <w:t>Follow an MVC architecture using vanilla JavaScript (ES6 modules)</w:t>
+            </w:r>
+          </w:p>
+          <w:p>
+            <w:pPr>
+              <w:widowControl w:val="0"/>
+              <w:numPr>
+                <w:ilvl w:val="0"/>
+                <w:numId w:val="1"/>
+              </w:numPr>
+              <w:pBdr>
+                <w:top w:val="nil"/>
+                <w:left w:val="nil"/>
+                <w:bottom w:val="nil"/>
+                <w:right w:val="nil"/>
+                <w:between w:val="nil"/>
+              </w:pBdr>
+              <w:spacing w:after="0" w:line="240" w:lineRule="auto"/>
+              <w:rPr>
+                <w:rFonts w:ascii="Times New Roman" w:eastAsia="Arial" w:hAnsi="Times New Roman" w:cs="Times New Roman"/>
+                <w:color w:val="000000"/>
+                <w:sz w:val="24"/>
+                <w:szCs w:val="24"/>
+                <w:lang w:eastAsia="en-CA"/>
+              </w:rPr>
+            </w:pPr>
+            <w:r>
+              <w:rPr>
+                <w:rFonts w:ascii="Times New Roman" w:eastAsia="Arial" w:hAnsi="Times New Roman" w:cs="Times New Roman"/>
+                <w:color w:val="000000"/>
+                <w:sz w:val="24"/>
+                <w:szCs w:val="24"/>
+                <w:lang w:eastAsia="en-CA"/>
+              </w:rPr>
+              <w:t>Integrate a backend database (</w:t>
+            </w:r>
+            <w:proofErr w:type="spellStart"/>
+            <w:r>
+              <w:rPr>
+                <w:rFonts w:ascii="Times New Roman" w:eastAsia="Arial" w:hAnsi="Times New Roman" w:cs="Times New Roman"/>
+                <w:color w:val="000000"/>
+                <w:sz w:val="24"/>
+                <w:szCs w:val="24"/>
+                <w:lang w:eastAsia="en-CA"/>
+              </w:rPr>
+              <w:t>Supabase</w:t>
+            </w:r>
+            <w:proofErr w:type="spellEnd"/>
+            <w:r>
+              <w:rPr>
+                <w:rFonts w:ascii="Times New Roman" w:eastAsia="Arial" w:hAnsi="Times New Roman" w:cs="Times New Roman"/>
+                <w:color w:val="000000"/>
+                <w:sz w:val="24"/>
+                <w:szCs w:val="24"/>
+                <w:lang w:eastAsia="en-CA"/>
+              </w:rPr>
+              <w:t>) for dynamic animal and hint data</w:t>
+            </w:r>
+          </w:p>
+          <w:p>
+            <w:pPr>
+              <w:widowControl w:val="0"/>
+              <w:numPr>
+                <w:ilvl w:val="0"/>
+                <w:numId w:val="1"/>
+              </w:numPr>
+              <w:pBdr>
+                <w:top w:val="nil"/>
+                <w:left w:val="nil"/>
+                <w:bottom w:val="nil"/>
+                <w:right w:val="nil"/>
+                <w:between w:val="nil"/>
+              </w:pBdr>
+              <w:spacing w:after="0" w:line="240" w:lineRule="auto"/>
+              <w:rPr>
+                <w:rFonts w:ascii="Times New Roman" w:eastAsia="Arial" w:hAnsi="Times New Roman" w:cs="Times New Roman"/>
+                <w:b/>
+                <w:bCs/>
+                <w:color w:val="000000"/>
+                <w:sz w:val="24"/>
+                <w:szCs w:val="24"/>
+                <w:lang w:eastAsia="en-CA"/>
+              </w:rPr>
+            </w:pPr>
+            <w:r>
+              <w:rPr>
+                <w:rFonts w:ascii="Times New Roman" w:eastAsia="Arial" w:hAnsi="Times New Roman" w:cs="Times New Roman"/>
+                <w:color w:val="000000"/>
+                <w:sz w:val="24"/>
+                <w:szCs w:val="24"/>
+                <w:lang w:eastAsia="en-CA"/>
+              </w:rPr>
+              <w:t>Deliver a clearly defined Minimum Viable Product (MVP) with core gameplay features</w:t>
+            </w:r>
+          </w:p>
+          <w:p>
+            <w:pPr>
+              <w:widowControl w:val="0"/>
+              <w:pBdr>
+                <w:top w:val="nil"/>
+                <w:left w:val="nil"/>
+                <w:bottom w:val="nil"/>
+                <w:right w:val="nil"/>
+                <w:between w:val="nil"/>
+              </w:pBdr>
+              <w:spacing w:after="0" w:line="240" w:lineRule="auto"/>
+              <w:rPr>
+                <w:rFonts w:ascii="Times New Roman" w:eastAsia="Arial" w:hAnsi="Times New Roman" w:cs="Times New Roman"/>
+                <w:color w:val="000000"/>
+                <w:sz w:val="24"/>
+                <w:szCs w:val="24"/>
+                <w:lang w:eastAsia="en-CA"/>
+              </w:rPr>
+            </w:pPr>
           </w:p>
           <w:p>
             <w:pPr>
@@ -1207,7 +1360,6 @@
                 <w:szCs w:val="24"/>
                 <w:lang w:eastAsia="en-CA"/>
               </w:rPr>
-              <w:lastRenderedPageBreak/>
               <w:t>Cost-Benefit Analysis</w:t>
             </w:r>
           </w:p>
@@ -1838,7 +1990,18 @@
                 <w:szCs w:val="24"/>
                 <w:lang w:eastAsia="en-CA"/>
               </w:rPr>
-              <w:t>Continued reliance on static learning materials may limit student engagement, reduce retention of ecosystem concepts, and provide no opportunity for interactive discovery-based learning.</w:t>
+              <w:t xml:space="preserve">Continued reliance on static learning materials may limit student engagement, reduce </w:t>
+            </w:r>
+            <w:r>
+              <w:rPr>
+                <w:rFonts w:ascii="Times New Roman" w:eastAsia="Arial" w:hAnsi="Times New Roman" w:cs="Times New Roman"/>
+                <w:color w:val="000000"/>
+                <w:sz w:val="24"/>
+                <w:szCs w:val="24"/>
+                <w:lang w:eastAsia="en-CA"/>
+              </w:rPr>
+              <w:lastRenderedPageBreak/>
+              <w:t>retention of ecosystem concepts, and provide no opportunity for interactive discovery-based learning.</w:t>
             </w:r>
           </w:p>
         </w:tc>
@@ -1889,6 +2052,7 @@
                 <w:szCs w:val="24"/>
                 <w:lang w:eastAsia="en-CA"/>
               </w:rPr>
+              <w:lastRenderedPageBreak/>
               <w:t>Recommendation</w:t>
             </w:r>
           </w:p>
@@ -3344,6 +3508,7 @@
   <w:style w:type="character" w:default="1" w:styleId="DefaultParagraphFont">
     <w:name w:val="Default Paragraph Font"/>
     <w:uiPriority w:val="1"/>
+    <w:semiHidden/>
     <w:unhideWhenUsed/>
   </w:style>
   <w:style w:type="table" w:default="1" w:styleId="TableNormal">

</xml_diff>